<commit_message>
security: externalise tel et email de l'organisme hors du repo
- config/organisme.json : suppression des champs tel et email
- config/org_settings.json : nouveau fichier gitignored contenant
  tel et email (à créer manuellement sur chaque environnement)
- .gitignore : ajout de config/org_settings.json
- scripts/build_templates.py : remplace le tel/email codés en dur
  dans le paragraphe source par {{ organisme_telephone }} / {{ organisme_email }}
- core/document_gen.py : _load_org_settings() charge org_settings.json
  et injecte les tags dans le contexte Jinja2 de la convention
- templates/convention.docx : rebuild avec les nouveaux tags (25 tags total)

Co-Authored-By: Claude Sonnet 4.6 <noreply@anthropic.com>
</commit_message>
<xml_diff>
--- a/templates/convention.docx
+++ b/templates/convention.docx
@@ -271,15 +271,14 @@
           <w:snapToGrid w:val="0"/>
           <w:szCs w:val="16"/>
         </w:rPr>
-        <w:t>Tel : 06 69 64 80 09 – contact@</w:t>
-      </w:r>
-      <w:r>
-        <w:rPr>
-          <w:rFonts w:ascii="Source Sans Pro" w:hAnsi="Source Sans Pro" w:cs="Arial"/>
-          <w:snapToGrid w:val="0"/>
-          <w:szCs w:val="16"/>
-        </w:rPr>
-        <w:t>koban-crm.com</w:t>
+        <w:t>Tel : {{ organisme_telephone }} – {{ organisme_email }}</w:t>
+      </w:r>
+      <w:r>
+        <w:rPr>
+          <w:rFonts w:ascii="Source Sans Pro" w:hAnsi="Source Sans Pro" w:cs="Arial"/>
+          <w:snapToGrid w:val="0"/>
+          <w:szCs w:val="16"/>
+        </w:rPr>
       </w:r>
     </w:p>
     <w:p>

</xml_diff>